<commit_message>
Fix cláusula cashback Starter: sem valores fixos, aplica a Premium ou Elite
- Remove menção a R$2.000, R$9.000, R$7.000 da cláusula
- Desconto = valor total pago pelo Plano Starter (dinâmico)
- Válido para renovação em Plano Premium OU Plano Elite
- Condições mantidas: 45 dias de serviço, intransferível, até 30 dias após encerramento
</commit_message>
<xml_diff>
--- a/assets/contratos/contrato-starter.docx
+++ b/assets/contratos/contrato-starter.docx
@@ -1102,103 +1102,102 @@
           <w:sz w:val="22"/>
           <w:szCs w:val="22"/>
         </w:rPr>
-        <w:t>CLÁUSULA 10ª – DO CASHBACK E RENOVAÇÃO</w:t>
-      </w:r>
-    </w:p>
-    <w:p>
-      <w:pPr>
-        <w:spacing w:after="60"/>
-      </w:pPr>
-      <w:r>
-        <w:rPr>
-          <w:rFonts w:ascii="Arial" w:cs="Arial" w:eastAsia="Arial" w:hAnsi="Arial"/>
-          <w:sz w:val="22"/>
-          <w:szCs w:val="22"/>
-        </w:rPr>
-        <w:t xml:space="preserve">10.1. A CONTRATANTE do Plano Starter terá direito a um benefício de cashback no valor de R$ 2.000,00 (dois mil reais), aplicável exclusivamente na contratação do Plano Premium da CONTRATADA, nas seguintes condições:</w:t>
-      </w:r>
-    </w:p>
-    <w:p>
-      <w:pPr>
-        <w:spacing w:after="60"/>
-        <w:ind w:left="360"/>
-      </w:pPr>
-      <w:r>
-        <w:rPr>
-          <w:rFonts w:ascii="Arial" w:cs="Arial" w:eastAsia="Arial" w:hAnsi="Arial"/>
-          <w:sz w:val="22"/>
-          <w:szCs w:val="22"/>
-        </w:rPr>
-        <w:t xml:space="preserve">a) O benefício de cashback somente será válido após 45 (quarenta e cinco) dias corridos de prestação ininterrupta dos serviços do Plano Starter;</w:t>
-      </w:r>
-    </w:p>
-    <w:p>
-      <w:pPr>
-        <w:spacing w:after="60"/>
-        <w:ind w:left="360"/>
-      </w:pPr>
-      <w:r>
-        <w:rPr>
-          <w:rFonts w:ascii="Arial" w:cs="Arial" w:eastAsia="Arial" w:hAnsi="Arial"/>
-          <w:sz w:val="22"/>
-          <w:szCs w:val="22"/>
-        </w:rPr>
-        <w:t xml:space="preserve">b) O cashback será concedido como desconto direto no valor do Plano Premium, que passará de R$ 9.000,00 (nove mil reais) para R$ 7.000,00 (sete mil reais);</w:t>
-      </w:r>
-    </w:p>
-    <w:p>
-      <w:pPr>
-        <w:spacing w:after="60"/>
-        <w:ind w:left="360"/>
-      </w:pPr>
-      <w:r>
-        <w:rPr>
-          <w:rFonts w:ascii="Arial" w:cs="Arial" w:eastAsia="Arial" w:hAnsi="Arial"/>
-          <w:sz w:val="22"/>
-          <w:szCs w:val="22"/>
-        </w:rPr>
-        <w:t xml:space="preserve">c) O benefício é intransferível, não convertível em espécie e somente poderá ser utilizado pelo CONTRATANTE deste instrumento;</w:t>
-      </w:r>
-    </w:p>
-    <w:p>
-      <w:pPr>
-        <w:spacing w:after="60"/>
-        <w:ind w:left="360"/>
-      </w:pPr>
-      <w:r>
-        <w:rPr>
-          <w:rFonts w:ascii="Arial" w:cs="Arial" w:eastAsia="Arial" w:hAnsi="Arial"/>
-          <w:sz w:val="22"/>
-          <w:szCs w:val="22"/>
-        </w:rPr>
-        <w:t xml:space="preserve">d) O cashback não é cumulativo com outros descontos, promoções ou benefícios eventualmente concedidos pela CONTRATADA;</w:t>
-      </w:r>
-    </w:p>
-    <w:p>
-      <w:pPr>
-        <w:spacing w:after="60"/>
-        <w:ind w:left="360"/>
-      </w:pPr>
-      <w:r>
-        <w:rPr>
-          <w:rFonts w:ascii="Arial" w:cs="Arial" w:eastAsia="Arial" w:hAnsi="Arial"/>
-          <w:sz w:val="22"/>
-          <w:szCs w:val="22"/>
-        </w:rPr>
-        <w:t xml:space="preserve">e) Para usufruir do benefício, o CONTRATANTE deverá manifestar interesse na renovação para o Plano Premium dentro do prazo de vigência deste contrato ou em até 30 (trinta) dias após o encerramento;</w:t>
-      </w:r>
-    </w:p>
-    <w:p>
-      <w:pPr>
-        <w:spacing w:after="60"/>
-      </w:pPr>
-      <w:r>
-        <w:rPr>
-          <w:rFonts w:ascii="Arial" w:cs="Arial" w:eastAsia="Arial" w:hAnsi="Arial"/>
-          <w:sz w:val="22"/>
-          <w:szCs w:val="22"/>
-        </w:rPr>
-        <w:t xml:space="preserve">10.2. O cashback previsto nesta cláusula constitui um incentivo comercial da CONTRATADA e não representa qualquer obrigação de renovação por parte da CONTRATANTE.</w:t>
+        <w:t>CLÁUSULA 10ª – DO BENEFÍCIO DE RENOVAÇÃO (CASHBACK)</w:t>
+      </w:r>
+    </w:p>
+    <w:p>
+      <w:pPr>
+        <w:spacing w:after="60"/>
+      </w:pPr>
+      <w:r>
+        <w:rPr>
+          <w:rFonts w:ascii="Arial" w:cs="Arial" w:eastAsia="Arial" w:hAnsi="Arial"/>
+          <w:sz w:val="22"/>
+          <w:szCs w:val="22"/>
+        </w:rPr>
+        <w:t xml:space="preserve">10.1. Ao CONTRATANTE do Plano Starter que permanecer com os serviços da CONTRATADA por, no mínimo, 45 (quarenta e cinco) dias corridos, será concedido um benefício de desconto equivalente ao valor total pago pelo presente contrato, aplicável exclusivamente na contratação do Plano Premium ou do Plano Elite da CONTRATADA.</w:t>
+      </w:r>
+    </w:p>
+    <w:p>
+      <w:pPr>
+        <w:spacing w:after="60"/>
+      </w:pPr>
+      <w:r>
+        <w:rPr>
+          <w:rFonts w:ascii="Arial" w:cs="Arial" w:eastAsia="Arial" w:hAnsi="Arial"/>
+          <w:sz w:val="22"/>
+          <w:szCs w:val="22"/>
+        </w:rPr>
+        <w:t xml:space="preserve">10.2. O benefício de desconto estará sujeito às seguintes condições:</w:t>
+      </w:r>
+    </w:p>
+    <w:p>
+      <w:pPr>
+        <w:spacing w:after="60"/>
+        <w:ind w:left="360"/>
+      </w:pPr>
+      <w:r>
+        <w:rPr>
+          <w:rFonts w:ascii="Arial" w:cs="Arial" w:eastAsia="Arial" w:hAnsi="Arial"/>
+          <w:sz w:val="22"/>
+          <w:szCs w:val="22"/>
+        </w:rPr>
+        <w:t xml:space="preserve">a) Somente será válido após o cumprimento integral de 45 (quarenta e cinco) dias corridos de prestação de serviços do Plano Starter;</w:t>
+      </w:r>
+    </w:p>
+    <w:p>
+      <w:pPr>
+        <w:spacing w:after="60"/>
+        <w:ind w:left="360"/>
+      </w:pPr>
+      <w:r>
+        <w:rPr>
+          <w:rFonts w:ascii="Arial" w:cs="Arial" w:eastAsia="Arial" w:hAnsi="Arial"/>
+          <w:sz w:val="22"/>
+          <w:szCs w:val="22"/>
+        </w:rPr>
+        <w:t xml:space="preserve">b) Deverá ser utilizado pelo próprio CONTRATANTE, sendo intransferível e não convertível em espécie;</w:t>
+      </w:r>
+    </w:p>
+    <w:p>
+      <w:pPr>
+        <w:spacing w:after="60"/>
+        <w:ind w:left="360"/>
+      </w:pPr>
+      <w:r>
+        <w:rPr>
+          <w:rFonts w:ascii="Arial" w:cs="Arial" w:eastAsia="Arial" w:hAnsi="Arial"/>
+          <w:sz w:val="22"/>
+          <w:szCs w:val="22"/>
+        </w:rPr>
+        <w:t xml:space="preserve">c) Aplica-se exclusivamente à contratação dos planos Premium ou Elite, sem cumulatividade com outros descontos ou benefícios;</w:t>
+      </w:r>
+    </w:p>
+    <w:p>
+      <w:pPr>
+        <w:spacing w:after="60"/>
+        <w:ind w:left="360"/>
+      </w:pPr>
+      <w:r>
+        <w:rPr>
+          <w:rFonts w:ascii="Arial" w:cs="Arial" w:eastAsia="Arial" w:hAnsi="Arial"/>
+          <w:sz w:val="22"/>
+          <w:szCs w:val="22"/>
+        </w:rPr>
+        <w:t xml:space="preserve">d) O CONTRATANTE deverá manifestar interesse na renovação durante a vigência deste contrato ou em até 30 (trinta) dias após o seu encerramento.</w:t>
+      </w:r>
+    </w:p>
+    <w:p>
+      <w:pPr>
+        <w:spacing w:after="60"/>
+      </w:pPr>
+      <w:r>
+        <w:rPr>
+          <w:rFonts w:ascii="Arial" w:cs="Arial" w:eastAsia="Arial" w:hAnsi="Arial"/>
+          <w:sz w:val="22"/>
+          <w:szCs w:val="22"/>
+        </w:rPr>
+        <w:t xml:space="preserve">10.3. O benefício previsto nesta cláusula constitui um incentivo comercial da CONTRATADA e não gera qualquer obrigação de renovação por parte do CONTRATANTE.</w:t>
       </w:r>
     </w:p>
     <w:p>

</xml_diff>

<commit_message>
Reescrever Cláusula 5 do contrato Starter para prazo fixo de 45 dias
- Remove condicionais {#mmr}/{/mmr} — Starter é sempre TCV
- Prazo fixo de 45 dias corridos, sem renovação automática
- Linguagem simplificada sem referência a meses
- 5.9: prazo fixo e improrrogável de 45 dias, extinção automática ao término
- 5.10/5.11: TCV — sem reembolso em caso de rescisão antecipada
- 5.12: nova cláusula — renovação por novo instrumento, sem obrigação para nenhuma das partes
</commit_message>
<xml_diff>
--- a/assets/contratos/contrato-starter.docx
+++ b/assets/contratos/contrato-starter.docx
@@ -543,44 +543,35 @@
     </w:p>
     <w:p>
       <w:pPr>
-        <w:pStyle w:val="Heading1"/>
-        <w:spacing w:after="160" w:before="240"/>
-      </w:pPr>
-      <w:r>
-        <w:rPr>
-          <w:rFonts w:ascii="Arial" w:cs="Arial" w:eastAsia="Arial" w:hAnsi="Arial"/>
-          <w:b/>
-          <w:bCs/>
-          <w:sz w:val="28"/>
-          <w:szCs w:val="28"/>
-        </w:rPr>
-        <w:t xml:space="preserve">CLÁUSULA 5ª – DO VALOR, FORMA DE PAGAMENTO E VIGÊNCIA</w:t>
-      </w:r>
-    </w:p>
-    <w:p>
-      <w:pPr>
-        <w:spacing w:after="160"/>
-      </w:pPr>
-      <w:r>
-        <w:rPr>
-          <w:rFonts w:ascii="Arial" w:cs="Arial" w:eastAsia="Arial" w:hAnsi="Arial"/>
-          <w:sz w:val="22"/>
-          <w:szCs w:val="22"/>
-        </w:rPr>
-        <w:t xml:space="preserve">5.1. Pelos serviços prestados, a CONTRATANTE pagará à CONTRATADA </w:t>
-      </w:r>
-      <w:r>
-        <w:rPr>
-          <w:rFonts w:ascii="Arial" w:cs="Arial" w:eastAsia="Arial" w:hAnsi="Arial"/>
-          <w:sz w:val="22"/>
-          <w:szCs w:val="22"/>
-        </w:rPr>
-        <w:t xml:space="preserve">{forma_pagamento}</w:t>
-      </w:r>
-    </w:p>
-    <w:p>
-      <w:pPr>
-        <w:spacing w:after="160"/>
+        <w:spacing w:before="120" w:after="60"/>
+      </w:pPr>
+      <w:r>
+        <w:rPr>
+          <w:rFonts w:ascii="Arial" w:cs="Arial" w:eastAsia="Arial" w:hAnsi="Arial"/>
+          <w:b/>
+          <w:bCs/>
+          <w:sz w:val="22"/>
+          <w:szCs w:val="22"/>
+        </w:rPr>
+        <w:t>CLÁUSULA 5ª – DO VALOR, FORMA DE PAGAMENTO E VIGÊNCIA</w:t>
+      </w:r>
+    </w:p>
+    <w:p>
+      <w:pPr>
+        <w:spacing w:after="60"/>
+      </w:pPr>
+      <w:r>
+        <w:rPr>
+          <w:rFonts w:ascii="Arial" w:cs="Arial" w:eastAsia="Arial" w:hAnsi="Arial"/>
+          <w:sz w:val="22"/>
+          <w:szCs w:val="22"/>
+        </w:rPr>
+        <w:t xml:space="preserve">5.1. Pelos serviços prestados, a CONTRATANTE pagará à CONTRATADA {forma_pagamento}</w:t>
+      </w:r>
+    </w:p>
+    <w:p>
+      <w:pPr>
+        <w:spacing w:after="60"/>
       </w:pPr>
       <w:r>
         <w:rPr>
@@ -593,33 +584,33 @@
     </w:p>
     <w:p>
       <w:pPr>
-        <w:spacing w:after="160"/>
-      </w:pPr>
-      <w:r>
-        <w:rPr>
-          <w:rFonts w:ascii="Arial" w:cs="Arial" w:eastAsia="Arial" w:hAnsi="Arial"/>
-          <w:sz w:val="22"/>
-          <w:szCs w:val="22"/>
-        </w:rPr>
-        <w:t xml:space="preserve">5.3. O parcelamento ou fracionamento do pagamento constitui mera facilidade concedida pela CONTRATADA e não descaracteriza a obrigação integral da CONTRATANTE em relação ao valor total do contrato firmado.</w:t>
-      </w:r>
-    </w:p>
-    <w:p>
-      <w:pPr>
-        <w:spacing w:after="160"/>
-      </w:pPr>
-      <w:r>
-        <w:rPr>
-          <w:rFonts w:ascii="Arial" w:cs="Arial" w:eastAsia="Arial" w:hAnsi="Arial"/>
-          <w:sz w:val="22"/>
-          <w:szCs w:val="22"/>
-        </w:rPr>
-        <w:t xml:space="preserve">5.4. Em caso de inadimplência, atraso, não processamento, cancelamento de cobrança, contestação de pagamento (chargeback), bloqueio de pagamento ou qualquer interrupção relacionada às cobranças contratadas, a CONTRATANTE permanecerá integralmente responsável pelos valores devidos, obrigando-se à regularização imediata por meio indicado pela CONTRATADA.</w:t>
-      </w:r>
-    </w:p>
-    <w:p>
-      <w:pPr>
-        <w:spacing w:after="160"/>
+        <w:spacing w:after="60"/>
+      </w:pPr>
+      <w:r>
+        <w:rPr>
+          <w:rFonts w:ascii="Arial" w:cs="Arial" w:eastAsia="Arial" w:hAnsi="Arial"/>
+          <w:sz w:val="22"/>
+          <w:szCs w:val="22"/>
+        </w:rPr>
+        <w:t xml:space="preserve">5.3. O parcelamento do pagamento constitui mera facilidade concedida pela CONTRATADA e não descaracteriza a obrigação integral da CONTRATANTE em relação ao valor total do contrato firmado.</w:t>
+      </w:r>
+    </w:p>
+    <w:p>
+      <w:pPr>
+        <w:spacing w:after="60"/>
+      </w:pPr>
+      <w:r>
+        <w:rPr>
+          <w:rFonts w:ascii="Arial" w:cs="Arial" w:eastAsia="Arial" w:hAnsi="Arial"/>
+          <w:sz w:val="22"/>
+          <w:szCs w:val="22"/>
+        </w:rPr>
+        <w:t xml:space="preserve">5.4. Em caso de inadimplência, atraso, cancelamento, contestação de pagamento (chargeback) ou qualquer interrupção relacionada às cobranças contratadas, a CONTRATANTE permanecerá integralmente responsável pelos valores devidos, obrigando-se à regularização imediata por meio indicado pela CONTRATADA.</w:t>
+      </w:r>
+    </w:p>
+    <w:p>
+      <w:pPr>
+        <w:spacing w:after="60"/>
       </w:pPr>
       <w:r>
         <w:rPr>
@@ -655,66 +646,52 @@
           <w:sz w:val="22"/>
           <w:szCs w:val="22"/>
         </w:rPr>
-        <w:t xml:space="preserve">b) interromper campanhas, anúncios, publicações, relatórios, treinamentos, consultorias, reuniões, acessos e demais entregas vinculadas ao contrato;</w:t>
-      </w:r>
-    </w:p>
-    <w:p>
-      <w:pPr>
-        <w:spacing w:after="60"/>
-        <w:ind w:left="360"/>
-      </w:pPr>
-      <w:r>
-        <w:rPr>
-          <w:rFonts w:ascii="Arial" w:cs="Arial" w:eastAsia="Arial" w:hAnsi="Arial"/>
-          <w:sz w:val="22"/>
-          <w:szCs w:val="22"/>
-        </w:rPr>
-        <w:t xml:space="preserve">c) bloquear acessos a plataformas, áreas de membros, materiais estratégicos, treinamentos e demais ativos disponibilizados durante a vigência contratual;</w:t>
-      </w:r>
-    </w:p>
-    <w:p>
-      <w:pPr>
-        <w:spacing w:after="60"/>
-        <w:ind w:left="360"/>
-      </w:pPr>
-      <w:r>
-        <w:rPr>
-          <w:rFonts w:ascii="Arial" w:cs="Arial" w:eastAsia="Arial" w:hAnsi="Arial"/>
-          <w:sz w:val="22"/>
-          <w:szCs w:val="22"/>
-        </w:rPr>
-        <w:t xml:space="preserve">d) adotar as medidas administrativas e judiciais cabíveis para cobrança dos valores em aberto.</w:t>
-      </w:r>
-    </w:p>
-    <w:p>
-      <w:pPr>
-        <w:spacing w:after="160"/>
-      </w:pPr>
-      <w:r>
-        <w:rPr>
-          <w:rFonts w:ascii="Arial" w:cs="Arial" w:eastAsia="Arial" w:hAnsi="Arial"/>
-          <w:sz w:val="22"/>
-          <w:szCs w:val="22"/>
-        </w:rPr>
-        <w:t xml:space="preserve">5.6. Em caso de atraso no pagamento, poderão incidir multa moratória de 2% (dois por cento) sobre o valor devido, juros de mora de 1% (um por cento) ao mês e correção monetária pelo índice oficial aplicável, sem prejuízo das demais medidas previstas neste contrato.</w:t>
-      </w:r>
-    </w:p>
-    <w:p>
-      <w:pPr>
-        <w:spacing w:after="160"/>
-      </w:pPr>
-      <w:r>
-        <w:rPr>
-          <w:rFonts w:ascii="Arial" w:cs="Arial" w:eastAsia="Arial" w:hAnsi="Arial"/>
-          <w:sz w:val="22"/>
-          <w:szCs w:val="22"/>
-        </w:rPr>
-        <w:t xml:space="preserve">5.7. Os valores pagos serão considerados contraprestação pelos serviços efetivamente prestados, pela disponibilidade da equipe, pela estrutura operacional, pelo planejamento estratégico, pela alocação de recursos, pela reserva de capacidade operacional e pelas atividades executadas desde o início da vigência contratual.</w:t>
-      </w:r>
-    </w:p>
-    <w:p>
-      <w:pPr>
-        <w:spacing w:after="160"/>
+        <w:t xml:space="preserve">b) interromper campanhas, anúncios, publicações, relatórios e demais entregas vinculadas ao contrato;</w:t>
+      </w:r>
+    </w:p>
+    <w:p>
+      <w:pPr>
+        <w:spacing w:after="60"/>
+        <w:ind w:left="360"/>
+      </w:pPr>
+      <w:r>
+        <w:rPr>
+          <w:rFonts w:ascii="Arial" w:cs="Arial" w:eastAsia="Arial" w:hAnsi="Arial"/>
+          <w:sz w:val="22"/>
+          <w:szCs w:val="22"/>
+        </w:rPr>
+        <w:t xml:space="preserve">c) adotar as medidas administrativas e judiciais cabíveis para cobrança dos valores em aberto.</w:t>
+      </w:r>
+    </w:p>
+    <w:p>
+      <w:pPr>
+        <w:spacing w:after="60"/>
+      </w:pPr>
+      <w:r>
+        <w:rPr>
+          <w:rFonts w:ascii="Arial" w:cs="Arial" w:eastAsia="Arial" w:hAnsi="Arial"/>
+          <w:sz w:val="22"/>
+          <w:szCs w:val="22"/>
+        </w:rPr>
+        <w:t xml:space="preserve">5.6. Em caso de atraso no pagamento, poderão incidir multa moratória de 2% (dois por cento) sobre o valor devido, juros de mora de 1% (um por cento) ao mês e correção monetária pelo índice oficial aplicável.</w:t>
+      </w:r>
+    </w:p>
+    <w:p>
+      <w:pPr>
+        <w:spacing w:after="60"/>
+      </w:pPr>
+      <w:r>
+        <w:rPr>
+          <w:rFonts w:ascii="Arial" w:cs="Arial" w:eastAsia="Arial" w:hAnsi="Arial"/>
+          <w:sz w:val="22"/>
+          <w:szCs w:val="22"/>
+        </w:rPr>
+        <w:t xml:space="preserve">5.7. Os valores pagos são contraprestação pelos serviços efetivamente prestados, pela disponibilidade da equipe, pelo planejamento estratégico e pela reserva de capacidade operacional desde o início da vigência contratual.</w:t>
+      </w:r>
+    </w:p>
+    <w:p>
+      <w:pPr>
+        <w:spacing w:after="60"/>
       </w:pPr>
       <w:r>
         <w:rPr>
@@ -727,148 +704,67 @@
     </w:p>
     <w:p>
       <w:pPr>
-        <w:spacing w:after="160"/>
-      </w:pPr>
-      <w:r>
-        <w:rPr>
-          <w:rFonts w:ascii="Arial" w:cs="Arial" w:eastAsia="Arial" w:hAnsi="Arial"/>
-          <w:sz w:val="22"/>
-          <w:szCs w:val="22"/>
-        </w:rPr>
-        <w:t xml:space="preserve">5.9. O presente contrato possui prazo mínimo de vigência de </w:t>
-      </w:r>
-      <w:r>
-        <w:rPr>
-          <w:rFonts w:ascii="Arial" w:cs="Arial" w:eastAsia="Arial" w:hAnsi="Arial"/>
-          <w:sz w:val="22"/>
-          <w:szCs w:val="22"/>
-        </w:rPr>
-        <w:t xml:space="preserve">{duracao_meses}</w:t>
-      </w:r>
-      <w:r>
-        <w:rPr>
-          <w:rFonts w:ascii="Arial" w:cs="Arial" w:eastAsia="Arial" w:hAnsi="Arial"/>
-          <w:sz w:val="22"/>
-          <w:szCs w:val="22"/>
-        </w:rPr>
-        <w:t xml:space="preserve"> meses, permanecendo as partes vinculadas ao período integral contratado.</w:t>
-      </w:r>
-    </w:p>
-    <w:p>
-      <w:pPr>
-        <w:spacing w:after="160"/>
-      </w:pPr>
-      <w:r>
-        <w:rPr>
-          <w:rFonts w:ascii="Arial" w:cs="Arial" w:eastAsia="Arial" w:hAnsi="Arial"/>
-          <w:sz w:val="22"/>
-          <w:szCs w:val="22"/>
-        </w:rPr>
-        <w:t xml:space="preserve">{#mmr}</w:t>
-      </w:r>
-    </w:p>
-    <w:p>
-      <w:pPr>
-        <w:spacing w:after="160"/>
-      </w:pPr>
-      <w:r>
-        <w:rPr>
-          <w:rFonts w:ascii="Arial" w:cs="Arial" w:eastAsia="Arial" w:hAnsi="Arial"/>
-          <w:sz w:val="22"/>
-          <w:szCs w:val="22"/>
-        </w:rPr>
-        <w:t xml:space="preserve">5.10. Caso a CONTRATANTE deseje encerrar o contrato sem incidência de multa, deverá comunicar formalmente a CONTRATADA com antecedência mínima de 20 (vinte) dias corridos do próximo vencimento.</w:t>
-      </w:r>
-    </w:p>
-    <w:p>
-      <w:pPr>
-        <w:spacing w:after="160"/>
-      </w:pPr>
-      <w:r>
-        <w:rPr>
-          <w:rFonts w:ascii="Arial" w:cs="Arial" w:eastAsia="Arial" w:hAnsi="Arial"/>
-          <w:sz w:val="22"/>
-          <w:szCs w:val="22"/>
-        </w:rPr>
-        <w:t xml:space="preserve">5.11. Na ausência do aviso prévio previsto na cláusula anterior, ou em caso de rescisão antecipada durante a vigência contratual, será devida multa compensatória correspondente a 50% (cinquenta por cento) do saldo contratual restante até o término do contrato.</w:t>
-      </w:r>
-    </w:p>
-    <w:p>
-      <w:pPr>
-        <w:spacing w:after="160"/>
-      </w:pPr>
-      <w:r>
-        <w:rPr>
-          <w:rFonts w:ascii="Arial" w:cs="Arial" w:eastAsia="Arial" w:hAnsi="Arial"/>
-          <w:sz w:val="22"/>
-          <w:szCs w:val="22"/>
-        </w:rPr>
-        <w:t xml:space="preserve">{/mmr}</w:t>
-      </w:r>
-    </w:p>
-    <w:p>
-      <w:pPr>
-        <w:spacing w:after="160"/>
-      </w:pPr>
-      <w:r>
-        <w:rPr>
-          <w:rFonts w:ascii="Arial" w:cs="Arial" w:eastAsia="Arial" w:hAnsi="Arial"/>
-          <w:sz w:val="22"/>
-          <w:szCs w:val="22"/>
-        </w:rPr>
-        <w:t xml:space="preserve">{^mmr}</w:t>
-      </w:r>
-    </w:p>
-    <w:p>
-      <w:pPr>
-        <w:spacing w:after="160"/>
-      </w:pPr>
-      <w:r>
-        <w:rPr>
-          <w:rFonts w:ascii="Arial" w:cs="Arial" w:eastAsia="Arial" w:hAnsi="Arial"/>
-          <w:sz w:val="22"/>
-          <w:szCs w:val="22"/>
-        </w:rPr>
-        <w:t xml:space="preserve">5.10. Tendo em vista que o valor contratado foi integralmente avençado sob a modalidade de Valor Total de Contrato (TCV), o cancelamento ou a rescisão antecipada por parte da CONTRATANTE não gera direito a reembolso, restituição ou compensação dos valores pagos ou devidos, nos termos da cláusula 5.8.</w:t>
-      </w:r>
-    </w:p>
-    <w:p>
-      <w:pPr>
-        <w:spacing w:after="160"/>
-      </w:pPr>
-      <w:r>
-        <w:rPr>
-          <w:rFonts w:ascii="Arial" w:cs="Arial" w:eastAsia="Arial" w:hAnsi="Arial"/>
-          <w:sz w:val="22"/>
-          <w:szCs w:val="22"/>
-        </w:rPr>
-        <w:t xml:space="preserve">5.11. Em caso de cancelamento ou rescisão antecipada, a totalidade do saldo remanescente do valor total do contrato permanecerá devida e exigível pela CONTRATADA, independentemente da eventual interrupção da prestação dos serviços.</w:t>
-      </w:r>
-    </w:p>
-    <w:p>
-      <w:pPr>
-        <w:spacing w:after="160"/>
-      </w:pPr>
-      <w:r>
-        <w:rPr>
-          <w:rFonts w:ascii="Arial" w:cs="Arial" w:eastAsia="Arial" w:hAnsi="Arial"/>
-          <w:sz w:val="22"/>
-          <w:szCs w:val="22"/>
-        </w:rPr>
-        <w:t xml:space="preserve">{/mmr}</w:t>
-      </w:r>
-    </w:p>
-    <w:p>
-      <w:pPr>
-        <w:spacing w:after="160"/>
-      </w:pPr>
-      <w:r>
-        <w:rPr>
-          <w:rFonts w:ascii="Arial" w:cs="Arial" w:eastAsia="Arial" w:hAnsi="Arial"/>
-          <w:sz w:val="22"/>
-          <w:szCs w:val="22"/>
-        </w:rPr>
-        <w:t xml:space="preserve">5.12. A rescisão contratual, independentemente do motivo, não desobriga a CONTRATANTE do pagamento dos valores vencidos até a data do encerramento efetivo da relação contratual.</w:t>
+        <w:spacing w:after="60"/>
+      </w:pPr>
+      <w:r>
+        <w:rPr>
+          <w:rFonts w:ascii="Arial" w:cs="Arial" w:eastAsia="Arial" w:hAnsi="Arial"/>
+          <w:sz w:val="22"/>
+          <w:szCs w:val="22"/>
+        </w:rPr>
+        <w:t xml:space="preserve">5.9. O presente contrato possui prazo fixo e improrrogável de 45 (quarenta e cinco) dias corridos, contados da data de início prevista na Cláusula 6ª, e não prevê renovação automática. O encerramento do prazo extingue automaticamente as obrigações de prestação de serviços da CONTRATADA.</w:t>
+      </w:r>
+    </w:p>
+    <w:p>
+      <w:pPr>
+        <w:spacing w:after="60"/>
+      </w:pPr>
+      <w:r>
+        <w:rPr>
+          <w:rFonts w:ascii="Arial" w:cs="Arial" w:eastAsia="Arial" w:hAnsi="Arial"/>
+          <w:sz w:val="22"/>
+          <w:szCs w:val="22"/>
+        </w:rPr>
+        <w:t xml:space="preserve">5.10. Tendo em vista que o valor contratado foi integralmente avençado sob a modalidade de Valor Total de Contrato (TCV), o cancelamento ou rescisão antecipada por parte da CONTRATANTE não gera direito a reembolso, restituição ou compensação dos valores pagos ou devidos.</w:t>
+      </w:r>
+    </w:p>
+    <w:p>
+      <w:pPr>
+        <w:spacing w:after="60"/>
+      </w:pPr>
+      <w:r>
+        <w:rPr>
+          <w:rFonts w:ascii="Arial" w:cs="Arial" w:eastAsia="Arial" w:hAnsi="Arial"/>
+          <w:sz w:val="22"/>
+          <w:szCs w:val="22"/>
+        </w:rPr>
+        <w:t xml:space="preserve">5.11. Em caso de rescisão antecipada, a totalidade do saldo remanescente do valor total do contrato permanecerá devida e exigível pela CONTRATADA, independentemente da interrupção da prestação dos serviços.</w:t>
+      </w:r>
+    </w:p>
+    <w:p>
+      <w:pPr>
+        <w:spacing w:after="60"/>
+      </w:pPr>
+      <w:r>
+        <w:rPr>
+          <w:rFonts w:ascii="Arial" w:cs="Arial" w:eastAsia="Arial" w:hAnsi="Arial"/>
+          <w:sz w:val="22"/>
+          <w:szCs w:val="22"/>
+        </w:rPr>
+        <w:t xml:space="preserve">5.12. Ao término dos 45 (quarenta e cinco) dias, as partes poderão, de comum acordo e por novo instrumento contratual, firmar a continuidade da prestação de serviços, sem que haja qualquer obrigação de renovação para qualquer das partes.</w:t>
+      </w:r>
+    </w:p>
+    <w:p>
+      <w:pPr>
+        <w:spacing w:after="60"/>
+      </w:pPr>
+      <w:r>
+        <w:rPr>
+          <w:rFonts w:ascii="Arial" w:cs="Arial" w:eastAsia="Arial" w:hAnsi="Arial"/>
+          <w:sz w:val="22"/>
+          <w:szCs w:val="22"/>
+        </w:rPr>
+        <w:t xml:space="preserve"/>
       </w:r>
     </w:p>
     <w:p>

</xml_diff>

<commit_message>
Contrato: (1) CNPJ do CONTRATANTE agora e sanitizado — so entra se for um CNPJ valido (14 digitos); texto colado por engano (titulo/descricao do evento do Google Agenda + link do Meet) e descartado, cai para linha de preenchimento. Nome do cliente tambem e limpo desse lixo. Campo CNPJ do modal ja carrega limpo. (2) Starter: corrige '45 dias meses' -> '45 dias' (removido o 'meses' fixo do modelo apos {duracao_meses}).
</commit_message>
<xml_diff>
--- a/assets/contratos/contrato-starter.docx
+++ b/assets/contratos/contrato-starter.docx
@@ -202,7 +202,7 @@
           <w:sz w:val="22"/>
           <w:szCs w:val="22"/>
         </w:rPr>
-        <w:t xml:space="preserve">{duracao_meses} meses</w:t>
+        <w:t xml:space="preserve">{duracao_meses}</w:t>
       </w:r>
       <w:r>
         <w:rPr>
@@ -803,7 +803,7 @@
           <w:sz w:val="22"/>
           <w:szCs w:val="22"/>
         </w:rPr>
-        <w:t xml:space="preserve">{duracao_meses} meses</w:t>
+        <w:t xml:space="preserve">{duracao_meses}</w:t>
       </w:r>
       <w:r>
         <w:rPr>

</xml_diff>